<commit_message>
auto: push changes 26-04-Sun_13-26-46
</commit_message>
<xml_diff>
--- a/Generateur Des Factures/Factures/Facture numéro 3-2026.docx
+++ b/Generateur Des Factures/Factures/Facture numéro 3-2026.docx
@@ -62,10 +62,6 @@
               </w:rPr>
               <w:t>Facture numéro :  3/2026</w:t>
             </w:r>
-            <w:proofErr w:type="gramStart"/>
-            <w:proofErr w:type="gramEnd"/>
-            <w:proofErr w:type="spellStart"/>
-            <w:proofErr w:type="spellEnd"/>
           </w:p>
         </w:tc>
       </w:tr>
@@ -114,8 +110,6 @@
               </w:rPr>
               <w:t>Date : 26/04/2026</w:t>
             </w:r>
-            <w:proofErr w:type="spellStart"/>
-            <w:proofErr w:type="spellEnd"/>
           </w:p>
         </w:tc>
       </w:tr>
@@ -133,7 +127,7 @@
           <w:noProof/>
         </w:rPr>
         <w:drawing>
-          <wp:anchor distT="0" distB="0" distL="114300" distR="114300" simplePos="0" relativeHeight="251667456" behindDoc="0" locked="0" layoutInCell="1" allowOverlap="1" wp14:anchorId="4A1A7FB3" wp14:editId="23244EF8">
+          <wp:anchor distT="0" distB="0" distL="114300" distR="114300" simplePos="0" relativeHeight="251667456" behindDoc="0" locked="0" layoutInCell="1" allowOverlap="1" wp14:anchorId="4A1A7FB3" wp14:editId="2D918B5C">
             <wp:simplePos x="0" y="0"/>
             <wp:positionH relativeFrom="column">
               <wp:posOffset>-264795</wp:posOffset>
@@ -191,7 +185,6 @@
             </wp14:sizeRelV>
           </wp:anchor>
         </w:drawing>
-        <w:t/>
       </w:r>
     </w:p>
     <w:p>
@@ -279,8 +272,6 @@
               </w:rPr>
               <w:t>ESAQ Certif</w:t>
             </w:r>
-            <w:proofErr w:type="spellStart"/>
-            <w:proofErr w:type="spellEnd"/>
           </w:p>
           <w:p>
             <w:pPr>
@@ -363,11 +354,80 @@
                 <w:szCs w:val="24"/>
                 <w:lang w:val="fr-FR"/>
               </w:rPr>
-              <w:t>12 rue sabri boujemaa 1er etg N 6, 
-Casablanca 20150</w:t>
+              <w:t xml:space="preserve">12 rue </w:t>
             </w:r>
             <w:proofErr w:type="spellStart"/>
+            <w:r>
+              <w:rPr>
+                <w:rFonts w:ascii="Aptos" w:eastAsia="+mn-ea" w:hAnsi="Aptos" w:cs="+mn-cs"/>
+                <w:color w:val="000000"/>
+                <w:kern w:val="24"/>
+                <w:sz w:val="24"/>
+                <w:szCs w:val="24"/>
+                <w:lang w:val="fr-FR"/>
+              </w:rPr>
+              <w:t>sabri</w:t>
+            </w:r>
             <w:proofErr w:type="spellEnd"/>
+            <w:r>
+              <w:rPr>
+                <w:rFonts w:ascii="Aptos" w:eastAsia="+mn-ea" w:hAnsi="Aptos" w:cs="+mn-cs"/>
+                <w:color w:val="000000"/>
+                <w:kern w:val="24"/>
+                <w:sz w:val="24"/>
+                <w:szCs w:val="24"/>
+                <w:lang w:val="fr-FR"/>
+              </w:rPr>
+              <w:t xml:space="preserve"> </w:t>
+            </w:r>
+            <w:proofErr w:type="spellStart"/>
+            <w:r>
+              <w:rPr>
+                <w:rFonts w:ascii="Aptos" w:eastAsia="+mn-ea" w:hAnsi="Aptos" w:cs="+mn-cs"/>
+                <w:color w:val="000000"/>
+                <w:kern w:val="24"/>
+                <w:sz w:val="24"/>
+                <w:szCs w:val="24"/>
+                <w:lang w:val="fr-FR"/>
+              </w:rPr>
+              <w:t>boujemaa</w:t>
+            </w:r>
+            <w:proofErr w:type="spellEnd"/>
+            <w:r>
+              <w:rPr>
+                <w:rFonts w:ascii="Aptos" w:eastAsia="+mn-ea" w:hAnsi="Aptos" w:cs="+mn-cs"/>
+                <w:color w:val="000000"/>
+                <w:kern w:val="24"/>
+                <w:sz w:val="24"/>
+                <w:szCs w:val="24"/>
+                <w:lang w:val="fr-FR"/>
+              </w:rPr>
+              <w:t xml:space="preserve"> 1er etg N </w:t>
+            </w:r>
+            <w:proofErr w:type="gramStart"/>
+            <w:r>
+              <w:rPr>
+                <w:rFonts w:ascii="Aptos" w:eastAsia="+mn-ea" w:hAnsi="Aptos" w:cs="+mn-cs"/>
+                <w:color w:val="000000"/>
+                <w:kern w:val="24"/>
+                <w:sz w:val="24"/>
+                <w:szCs w:val="24"/>
+                <w:lang w:val="fr-FR"/>
+              </w:rPr>
+              <w:t>6,  Casablanca</w:t>
+            </w:r>
+            <w:proofErr w:type="gramEnd"/>
+            <w:r>
+              <w:rPr>
+                <w:rFonts w:ascii="Aptos" w:eastAsia="+mn-ea" w:hAnsi="Aptos" w:cs="+mn-cs"/>
+                <w:color w:val="000000"/>
+                <w:kern w:val="24"/>
+                <w:sz w:val="24"/>
+                <w:szCs w:val="24"/>
+                <w:lang w:val="fr-FR"/>
+              </w:rPr>
+              <w:t xml:space="preserve"> 20150</w:t>
+            </w:r>
           </w:p>
         </w:tc>
       </w:tr>
@@ -399,8 +459,6 @@
               </w:rPr>
               <w:t>ICE : 003503208000024</w:t>
             </w:r>
-            <w:proofErr w:type="spellStart"/>
-            <w:proofErr w:type="spellEnd"/>
           </w:p>
         </w:tc>
       </w:tr>
@@ -829,16 +887,26 @@
               </w:rPr>
               <w:t xml:space="preserve">• Frais de déplacement </w:t>
             </w:r>
+          </w:p>
+          <w:p>
+            <w:pPr>
+              <w:spacing w:after="0" w:line="240" w:lineRule="auto"/>
+              <w:ind w:left="120"/>
+              <w:rPr>
+                <w:rFonts w:ascii="Arial" w:eastAsia="Times New Roman" w:hAnsi="Arial" w:cs="Arial"/>
+                <w:sz w:val="24"/>
+                <w:szCs w:val="24"/>
+                <w:lang w:val="fr-FR" w:eastAsia="fr-MA"/>
+              </w:rPr>
+            </w:pPr>
             <w:r>
               <w:rPr>
                 <w:rFonts w:ascii="Arial" w:eastAsia="Times New Roman" w:hAnsi="Arial" w:cs="Arial"/>
-                <w:b/>
-                <w:bCs/>
-                <w:sz w:val="20"/>
-                <w:szCs w:val="20"/>
-                <w:lang w:eastAsia="fr-MA"/>
-              </w:rPr>
-              <w:t/>
+                <w:sz w:val="24"/>
+                <w:szCs w:val="24"/>
+                <w:lang w:val="fr-FR" w:eastAsia="fr-MA"/>
+              </w:rPr>
+              <w:t xml:space="preserve"> </w:t>
             </w:r>
           </w:p>
           <w:p>
@@ -861,17 +929,6 @@
               </w:rPr>
               <w:t xml:space="preserve"> </w:t>
             </w:r>
-            <w:r>
-              <w:rPr>
-                <w:rFonts w:ascii="Arial" w:eastAsia="Times New Roman" w:hAnsi="Arial" w:cs="Arial"/>
-                <w:b/>
-                <w:bCs/>
-                <w:sz w:val="20"/>
-                <w:szCs w:val="20"/>
-                <w:lang w:eastAsia="fr-MA"/>
-              </w:rPr>
-              <w:t/>
-            </w:r>
           </w:p>
           <w:p>
             <w:pPr>
@@ -892,49 +949,6 @@
                 <w:lang w:val="fr-FR" w:eastAsia="fr-MA"/>
               </w:rPr>
               <w:t xml:space="preserve"> </w:t>
-            </w:r>
-            <w:r>
-              <w:rPr>
-                <w:rFonts w:ascii="Arial" w:eastAsia="Times New Roman" w:hAnsi="Arial" w:cs="Arial"/>
-                <w:b/>
-                <w:bCs/>
-                <w:sz w:val="20"/>
-                <w:szCs w:val="20"/>
-                <w:lang w:eastAsia="fr-MA"/>
-              </w:rPr>
-              <w:t/>
-            </w:r>
-          </w:p>
-          <w:p>
-            <w:pPr>
-              <w:spacing w:after="0" w:line="240" w:lineRule="auto"/>
-              <w:ind w:left="120"/>
-              <w:rPr>
-                <w:rFonts w:ascii="Arial" w:eastAsia="Times New Roman" w:hAnsi="Arial" w:cs="Arial"/>
-                <w:sz w:val="24"/>
-                <w:szCs w:val="24"/>
-                <w:lang w:val="fr-FR" w:eastAsia="fr-MA"/>
-              </w:rPr>
-            </w:pPr>
-            <w:r>
-              <w:rPr>
-                <w:rFonts w:ascii="Arial" w:eastAsia="Times New Roman" w:hAnsi="Arial" w:cs="Arial"/>
-                <w:sz w:val="24"/>
-                <w:szCs w:val="24"/>
-                <w:lang w:val="fr-FR" w:eastAsia="fr-MA"/>
-              </w:rPr>
-              <w:t xml:space="preserve"> </w:t>
-            </w:r>
-            <w:r>
-              <w:rPr>
-                <w:rFonts w:ascii="Arial" w:eastAsia="Times New Roman" w:hAnsi="Arial" w:cs="Arial"/>
-                <w:b/>
-                <w:bCs/>
-                <w:sz w:val="20"/>
-                <w:szCs w:val="20"/>
-                <w:lang w:eastAsia="fr-MA"/>
-              </w:rPr>
-              <w:t/>
             </w:r>
           </w:p>
           <w:p>
@@ -1037,17 +1051,6 @@
                 <w:lang w:val="en-US" w:eastAsia="fr-MA"/>
               </w:rPr>
             </w:pPr>
-            <w:r>
-              <w:rPr>
-                <w:rFonts w:ascii="Aptos" w:eastAsia="Times New Roman" w:hAnsi="Aptos" w:cs="Arial"/>
-                <w:color w:val="000000"/>
-                <w:kern w:val="24"/>
-                <w:sz w:val="24"/>
-                <w:szCs w:val="24"/>
-                <w:lang w:val="en-US" w:eastAsia="fr-MA"/>
-              </w:rPr>
-              <w:t/>
-            </w:r>
           </w:p>
           <w:p>
             <w:pPr>
@@ -1061,17 +1064,6 @@
                 <w:lang w:val="en-US" w:eastAsia="fr-MA"/>
               </w:rPr>
             </w:pPr>
-            <w:r>
-              <w:rPr>
-                <w:rFonts w:ascii="Aptos" w:eastAsia="Times New Roman" w:hAnsi="Aptos" w:cs="Arial"/>
-                <w:color w:val="000000"/>
-                <w:kern w:val="24"/>
-                <w:sz w:val="24"/>
-                <w:szCs w:val="24"/>
-                <w:lang w:val="en-US" w:eastAsia="fr-MA"/>
-              </w:rPr>
-              <w:t/>
-            </w:r>
           </w:p>
           <w:p>
             <w:pPr>
@@ -1085,17 +1077,6 @@
                 <w:lang w:val="en-US" w:eastAsia="fr-MA"/>
               </w:rPr>
             </w:pPr>
-            <w:r>
-              <w:rPr>
-                <w:rFonts w:ascii="Aptos" w:eastAsia="Times New Roman" w:hAnsi="Aptos" w:cs="Arial"/>
-                <w:color w:val="000000"/>
-                <w:kern w:val="24"/>
-                <w:sz w:val="24"/>
-                <w:szCs w:val="24"/>
-                <w:lang w:val="en-US" w:eastAsia="fr-MA"/>
-              </w:rPr>
-              <w:t/>
-            </w:r>
           </w:p>
         </w:tc>
         <w:tc>
@@ -1175,17 +1156,6 @@
                 <w:lang w:val="en-US" w:eastAsia="fr-MA"/>
               </w:rPr>
             </w:pPr>
-            <w:r>
-              <w:rPr>
-                <w:rFonts w:ascii="Aptos" w:eastAsia="Times New Roman" w:hAnsi="Aptos" w:cs="Arial"/>
-                <w:color w:val="000000"/>
-                <w:kern w:val="24"/>
-                <w:sz w:val="24"/>
-                <w:szCs w:val="24"/>
-                <w:lang w:val="en-US" w:eastAsia="fr-MA"/>
-              </w:rPr>
-              <w:t/>
-            </w:r>
           </w:p>
           <w:p>
             <w:pPr>
@@ -1199,17 +1169,6 @@
                 <w:lang w:val="en-US" w:eastAsia="fr-MA"/>
               </w:rPr>
             </w:pPr>
-            <w:r>
-              <w:rPr>
-                <w:rFonts w:ascii="Aptos" w:eastAsia="Times New Roman" w:hAnsi="Aptos" w:cs="Arial"/>
-                <w:color w:val="000000"/>
-                <w:kern w:val="24"/>
-                <w:sz w:val="24"/>
-                <w:szCs w:val="24"/>
-                <w:lang w:val="en-US" w:eastAsia="fr-MA"/>
-              </w:rPr>
-              <w:t/>
-            </w:r>
           </w:p>
           <w:p>
             <w:pPr>
@@ -1223,17 +1182,6 @@
                 <w:lang w:val="en-US" w:eastAsia="fr-MA"/>
               </w:rPr>
             </w:pPr>
-            <w:r>
-              <w:rPr>
-                <w:rFonts w:ascii="Aptos" w:eastAsia="Times New Roman" w:hAnsi="Aptos" w:cs="Arial"/>
-                <w:color w:val="000000"/>
-                <w:kern w:val="24"/>
-                <w:sz w:val="24"/>
-                <w:szCs w:val="24"/>
-                <w:lang w:val="en-US" w:eastAsia="fr-MA"/>
-              </w:rPr>
-              <w:t/>
-            </w:r>
           </w:p>
         </w:tc>
         <w:tc>
@@ -1313,17 +1261,6 @@
                 <w:lang w:val="en-US" w:eastAsia="fr-MA"/>
               </w:rPr>
             </w:pPr>
-            <w:r>
-              <w:rPr>
-                <w:rFonts w:ascii="Aptos" w:eastAsia="Times New Roman" w:hAnsi="Aptos" w:cs="Arial"/>
-                <w:color w:val="000000"/>
-                <w:kern w:val="24"/>
-                <w:sz w:val="24"/>
-                <w:szCs w:val="24"/>
-                <w:lang w:val="en-US" w:eastAsia="fr-MA"/>
-              </w:rPr>
-              <w:t/>
-            </w:r>
           </w:p>
           <w:p>
             <w:pPr>
@@ -1337,17 +1274,6 @@
                 <w:lang w:val="en-US" w:eastAsia="fr-MA"/>
               </w:rPr>
             </w:pPr>
-            <w:r>
-              <w:rPr>
-                <w:rFonts w:ascii="Aptos" w:eastAsia="Times New Roman" w:hAnsi="Aptos" w:cs="Arial"/>
-                <w:color w:val="000000"/>
-                <w:kern w:val="24"/>
-                <w:sz w:val="24"/>
-                <w:szCs w:val="24"/>
-                <w:lang w:val="en-US" w:eastAsia="fr-MA"/>
-              </w:rPr>
-              <w:t/>
-            </w:r>
           </w:p>
           <w:p>
             <w:pPr>
@@ -1361,17 +1287,6 @@
                 <w:lang w:val="en-US" w:eastAsia="fr-MA"/>
               </w:rPr>
             </w:pPr>
-            <w:r>
-              <w:rPr>
-                <w:rFonts w:ascii="Aptos" w:eastAsia="Times New Roman" w:hAnsi="Aptos" w:cs="Arial"/>
-                <w:color w:val="000000"/>
-                <w:kern w:val="24"/>
-                <w:sz w:val="24"/>
-                <w:szCs w:val="24"/>
-                <w:lang w:val="en-US" w:eastAsia="fr-MA"/>
-              </w:rPr>
-              <w:t/>
-            </w:r>
           </w:p>
         </w:tc>
       </w:tr>
@@ -1393,9 +1308,9 @@
         <w:tblLook w:val="04A0" w:firstRow="1" w:lastRow="0" w:firstColumn="1" w:lastColumn="0" w:noHBand="0" w:noVBand="1"/>
       </w:tblPr>
       <w:tblGrid>
-        <w:gridCol w:w="5027"/>
-        <w:gridCol w:w="2924"/>
-        <w:gridCol w:w="1825"/>
+        <w:gridCol w:w="5382"/>
+        <w:gridCol w:w="3118"/>
+        <w:gridCol w:w="1276"/>
       </w:tblGrid>
       <w:tr>
         <w:tc>
@@ -1442,8 +1357,6 @@
               </w:rPr>
               <w:t>14000</w:t>
             </w:r>
-            <w:proofErr w:type="spellStart"/>
-            <w:proofErr w:type="spellEnd"/>
           </w:p>
         </w:tc>
       </w:tr>
@@ -1483,8 +1396,6 @@
             <w:r>
               <w:t>ARRETE LA PRESENTE FACTURE A LA SOMME DE : #Quatorze mille dirhams#</w:t>
             </w:r>
-            <w:proofErr w:type="gramStart"/>
-            <w:proofErr w:type="gramEnd"/>
           </w:p>
           <w:p>
             <w:pPr>
@@ -1512,10 +1423,6 @@
               </w:rPr>
               <w:t>Attijariwafa Bank RIB :  007780000401230040249794</w:t>
             </w:r>
-            <w:proofErr w:type="gramStart"/>
-            <w:proofErr w:type="gramEnd"/>
-            <w:proofErr w:type="spellStart"/>
-            <w:proofErr w:type="spellEnd"/>
           </w:p>
         </w:tc>
       </w:tr>
@@ -1547,6 +1454,73 @@
           <w:noProof/>
         </w:rPr>
       </w:pPr>
+      <w:r>
+        <w:rPr>
+          <w:noProof/>
+        </w:rPr>
+        <w:drawing>
+          <wp:anchor distT="0" distB="0" distL="114300" distR="114300" simplePos="0" relativeHeight="251668480" behindDoc="1" locked="0" layoutInCell="1" allowOverlap="1" wp14:anchorId="730BAF44" wp14:editId="62C8E9EB">
+            <wp:simplePos x="0" y="0"/>
+            <wp:positionH relativeFrom="column">
+              <wp:posOffset>4603221</wp:posOffset>
+            </wp:positionH>
+            <wp:positionV relativeFrom="paragraph">
+              <wp:posOffset>84021</wp:posOffset>
+            </wp:positionV>
+            <wp:extent cx="1587500" cy="683260"/>
+            <wp:effectExtent l="38100" t="76200" r="50800" b="97790"/>
+            <wp:wrapNone/>
+            <wp:docPr id="1246332295" name="Picture 2"/>
+            <wp:cNvGraphicFramePr>
+              <a:graphicFrameLocks xmlns:a="http://schemas.openxmlformats.org/drawingml/2006/main" noChangeAspect="1"/>
+            </wp:cNvGraphicFramePr>
+            <a:graphic xmlns:a="http://schemas.openxmlformats.org/drawingml/2006/main">
+              <a:graphicData uri="http://schemas.openxmlformats.org/drawingml/2006/picture">
+                <pic:pic xmlns:pic="http://schemas.openxmlformats.org/drawingml/2006/picture">
+                  <pic:nvPicPr>
+                    <pic:cNvPr id="0" name="Picture 3"/>
+                    <pic:cNvPicPr>
+                      <a:picLocks noChangeAspect="1" noChangeArrowheads="1"/>
+                    </pic:cNvPicPr>
+                  </pic:nvPicPr>
+                  <pic:blipFill>
+                    <a:blip r:embed="rId9" cstate="print">
+                      <a:extLst>
+                        <a:ext uri="{28A0092B-C50C-407E-A947-70E740481C1C}">
+                          <a14:useLocalDpi xmlns:a14="http://schemas.microsoft.com/office/drawing/2010/main" val="0"/>
+                        </a:ext>
+                      </a:extLst>
+                    </a:blip>
+                    <a:srcRect/>
+                    <a:stretch>
+                      <a:fillRect/>
+                    </a:stretch>
+                  </pic:blipFill>
+                  <pic:spPr bwMode="auto">
+                    <a:xfrm rot="406662">
+                      <a:off x="0" y="0"/>
+                      <a:ext cx="1587500" cy="683260"/>
+                    </a:xfrm>
+                    <a:prstGeom prst="rect">
+                      <a:avLst/>
+                    </a:prstGeom>
+                    <a:noFill/>
+                    <a:ln>
+                      <a:noFill/>
+                    </a:ln>
+                  </pic:spPr>
+                </pic:pic>
+              </a:graphicData>
+            </a:graphic>
+            <wp14:sizeRelH relativeFrom="margin">
+              <wp14:pctWidth>0</wp14:pctWidth>
+            </wp14:sizeRelH>
+            <wp14:sizeRelV relativeFrom="margin">
+              <wp14:pctHeight>0</wp14:pctHeight>
+            </wp14:sizeRelV>
+          </wp:anchor>
+        </w:drawing>
+      </w:r>
       <w:r>
         <w:rPr>
           <w:noProof/>
@@ -1559,12 +1533,12 @@
     </w:p>
     <w:p/>
     <w:sectPr>
-      <w:headerReference w:type="even" r:id="rId9"/>
-      <w:headerReference w:type="default" r:id="rId10"/>
-      <w:footerReference w:type="even" r:id="rId11"/>
-      <w:footerReference w:type="default" r:id="rId12"/>
-      <w:headerReference w:type="first" r:id="rId13"/>
-      <w:footerReference w:type="first" r:id="rId14"/>
+      <w:headerReference w:type="even" r:id="rId10"/>
+      <w:headerReference w:type="default" r:id="rId11"/>
+      <w:footerReference w:type="even" r:id="rId12"/>
+      <w:footerReference w:type="default" r:id="rId13"/>
+      <w:headerReference w:type="first" r:id="rId14"/>
+      <w:footerReference w:type="first" r:id="rId15"/>
       <w:pgSz w:w="11906" w:h="16838"/>
       <w:pgMar w:top="1170" w:right="1417" w:bottom="1417" w:left="1417" w:header="708" w:footer="0" w:gutter="0"/>
       <w:cols w:space="708"/>
@@ -3504,6 +3478,7 @@
   <w:style w:type="character" w:default="1" w:styleId="DefaultParagraphFont">
     <w:name w:val="Default Paragraph Font"/>
     <w:uiPriority w:val="1"/>
+    <w:semiHidden/>
     <w:unhideWhenUsed/>
   </w:style>
   <w:style w:type="table" w:default="1" w:styleId="TableNormal">

</xml_diff>

<commit_message>
auto: push changes 26-04-Sun_22-21-02
</commit_message>
<xml_diff>
--- a/Generateur Des Factures/Factures/Facture numéro 3-2026.docx
+++ b/Generateur Des Factures/Factures/Facture numéro 3-2026.docx
@@ -62,6 +62,10 @@
               </w:rPr>
               <w:t>Facture numéro :  3/2026</w:t>
             </w:r>
+            <w:proofErr w:type="gramStart"/>
+            <w:proofErr w:type="gramEnd"/>
+            <w:proofErr w:type="spellStart"/>
+            <w:proofErr w:type="spellEnd"/>
           </w:p>
         </w:tc>
       </w:tr>
@@ -110,6 +114,8 @@
               </w:rPr>
               <w:t>Date : 26/04/2026</w:t>
             </w:r>
+            <w:proofErr w:type="spellStart"/>
+            <w:proofErr w:type="spellEnd"/>
           </w:p>
         </w:tc>
       </w:tr>
@@ -127,7 +133,7 @@
           <w:noProof/>
         </w:rPr>
         <w:drawing>
-          <wp:anchor distT="0" distB="0" distL="114300" distR="114300" simplePos="0" relativeHeight="251667456" behindDoc="0" locked="0" layoutInCell="1" allowOverlap="1" wp14:anchorId="4A1A7FB3" wp14:editId="2D918B5C">
+          <wp:anchor distT="0" distB="0" distL="114300" distR="114300" simplePos="0" relativeHeight="251667456" behindDoc="0" locked="0" layoutInCell="1" allowOverlap="1" wp14:anchorId="4A1A7FB3" wp14:editId="23244EF8">
             <wp:simplePos x="0" y="0"/>
             <wp:positionH relativeFrom="column">
               <wp:posOffset>-264795</wp:posOffset>
@@ -185,6 +191,7 @@
             </wp14:sizeRelV>
           </wp:anchor>
         </w:drawing>
+        <w:t/>
       </w:r>
     </w:p>
     <w:p>
@@ -272,6 +279,8 @@
               </w:rPr>
               <w:t>ESAQ Certif</w:t>
             </w:r>
+            <w:proofErr w:type="spellStart"/>
+            <w:proofErr w:type="spellEnd"/>
           </w:p>
           <w:p>
             <w:pPr>
@@ -354,104 +363,11 @@
                 <w:szCs w:val="24"/>
                 <w:lang w:val="fr-FR"/>
               </w:rPr>
-              <w:t xml:space="preserve">12 rue </w:t>
+              <w:t>12 rue sabri boujemaa 1er etg N 6, 
+Casablanca 20150</w:t>
             </w:r>
             <w:proofErr w:type="spellStart"/>
-            <w:r>
-              <w:rPr>
-                <w:rFonts w:ascii="Aptos" w:eastAsia="+mn-ea" w:hAnsi="Aptos" w:cs="+mn-cs"/>
-                <w:color w:val="000000"/>
-                <w:kern w:val="24"/>
-                <w:sz w:val="24"/>
-                <w:szCs w:val="24"/>
-                <w:lang w:val="fr-FR"/>
-              </w:rPr>
-              <w:t>sabri</w:t>
-            </w:r>
             <w:proofErr w:type="spellEnd"/>
-            <w:r>
-              <w:rPr>
-                <w:rFonts w:ascii="Aptos" w:eastAsia="+mn-ea" w:hAnsi="Aptos" w:cs="+mn-cs"/>
-                <w:color w:val="000000"/>
-                <w:kern w:val="24"/>
-                <w:sz w:val="24"/>
-                <w:szCs w:val="24"/>
-                <w:lang w:val="fr-FR"/>
-              </w:rPr>
-              <w:t xml:space="preserve"> </w:t>
-            </w:r>
-            <w:proofErr w:type="spellStart"/>
-            <w:r>
-              <w:rPr>
-                <w:rFonts w:ascii="Aptos" w:eastAsia="+mn-ea" w:hAnsi="Aptos" w:cs="+mn-cs"/>
-                <w:color w:val="000000"/>
-                <w:kern w:val="24"/>
-                <w:sz w:val="24"/>
-                <w:szCs w:val="24"/>
-                <w:lang w:val="fr-FR"/>
-              </w:rPr>
-              <w:t>boujemaa</w:t>
-            </w:r>
-            <w:proofErr w:type="spellEnd"/>
-            <w:r>
-              <w:rPr>
-                <w:rFonts w:ascii="Aptos" w:eastAsia="+mn-ea" w:hAnsi="Aptos" w:cs="+mn-cs"/>
-                <w:color w:val="000000"/>
-                <w:kern w:val="24"/>
-                <w:sz w:val="24"/>
-                <w:szCs w:val="24"/>
-                <w:lang w:val="fr-FR"/>
-              </w:rPr>
-              <w:t xml:space="preserve"> 1er </w:t>
-            </w:r>
-            <w:proofErr w:type="spellStart"/>
-            <w:r>
-              <w:rPr>
-                <w:rFonts w:ascii="Aptos" w:eastAsia="+mn-ea" w:hAnsi="Aptos" w:cs="+mn-cs"/>
-                <w:color w:val="000000"/>
-                <w:kern w:val="24"/>
-                <w:sz w:val="24"/>
-                <w:szCs w:val="24"/>
-                <w:lang w:val="fr-FR"/>
-              </w:rPr>
-              <w:t>etg</w:t>
-            </w:r>
-            <w:proofErr w:type="spellEnd"/>
-            <w:r>
-              <w:rPr>
-                <w:rFonts w:ascii="Aptos" w:eastAsia="+mn-ea" w:hAnsi="Aptos" w:cs="+mn-cs"/>
-                <w:color w:val="000000"/>
-                <w:kern w:val="24"/>
-                <w:sz w:val="24"/>
-                <w:szCs w:val="24"/>
-                <w:lang w:val="fr-FR"/>
-              </w:rPr>
-              <w:t xml:space="preserve"> N </w:t>
-            </w:r>
-            <w:proofErr w:type="gramStart"/>
-            <w:r>
-              <w:rPr>
-                <w:rFonts w:ascii="Aptos" w:eastAsia="+mn-ea" w:hAnsi="Aptos" w:cs="+mn-cs"/>
-                <w:color w:val="000000"/>
-                <w:kern w:val="24"/>
-                <w:sz w:val="24"/>
-                <w:szCs w:val="24"/>
-                <w:lang w:val="fr-FR"/>
-              </w:rPr>
-              <w:t>6,  Casablanca</w:t>
-            </w:r>
-            <w:proofErr w:type="gramEnd"/>
-            <w:r>
-              <w:rPr>
-                <w:rFonts w:ascii="Aptos" w:eastAsia="+mn-ea" w:hAnsi="Aptos" w:cs="+mn-cs"/>
-                <w:color w:val="000000"/>
-                <w:kern w:val="24"/>
-                <w:sz w:val="24"/>
-                <w:szCs w:val="24"/>
-                <w:lang w:val="fr-FR"/>
-              </w:rPr>
-              <w:t xml:space="preserve"> 20150</w:t>
-            </w:r>
           </w:p>
         </w:tc>
       </w:tr>
@@ -483,6 +399,8 @@
               </w:rPr>
               <w:t>ICE : 003503208000024</w:t>
             </w:r>
+            <w:proofErr w:type="spellStart"/>
+            <w:proofErr w:type="spellEnd"/>
           </w:p>
         </w:tc>
       </w:tr>
@@ -911,26 +829,16 @@
               </w:rPr>
               <w:t xml:space="preserve">• Frais de déplacement </w:t>
             </w:r>
-          </w:p>
-          <w:p>
-            <w:pPr>
-              <w:spacing w:after="0" w:line="240" w:lineRule="auto"/>
-              <w:ind w:left="120"/>
+            <w:r>
               <w:rPr>
                 <w:rFonts w:ascii="Arial" w:eastAsia="Times New Roman" w:hAnsi="Arial" w:cs="Arial"/>
-                <w:sz w:val="24"/>
-                <w:szCs w:val="24"/>
-                <w:lang w:val="fr-FR" w:eastAsia="fr-MA"/>
-              </w:rPr>
-            </w:pPr>
-            <w:r>
-              <w:rPr>
-                <w:rFonts w:ascii="Arial" w:eastAsia="Times New Roman" w:hAnsi="Arial" w:cs="Arial"/>
-                <w:sz w:val="24"/>
-                <w:szCs w:val="24"/>
-                <w:lang w:val="fr-FR" w:eastAsia="fr-MA"/>
-              </w:rPr>
-              <w:t xml:space="preserve"> </w:t>
+                <w:b/>
+                <w:bCs/>
+                <w:sz w:val="20"/>
+                <w:szCs w:val="20"/>
+                <w:lang w:eastAsia="fr-MA"/>
+              </w:rPr>
+              <w:t/>
             </w:r>
           </w:p>
           <w:p>
@@ -953,6 +861,17 @@
               </w:rPr>
               <w:t xml:space="preserve"> </w:t>
             </w:r>
+            <w:r>
+              <w:rPr>
+                <w:rFonts w:ascii="Arial" w:eastAsia="Times New Roman" w:hAnsi="Arial" w:cs="Arial"/>
+                <w:b/>
+                <w:bCs/>
+                <w:sz w:val="20"/>
+                <w:szCs w:val="20"/>
+                <w:lang w:eastAsia="fr-MA"/>
+              </w:rPr>
+              <w:t/>
+            </w:r>
           </w:p>
           <w:p>
             <w:pPr>
@@ -973,6 +892,49 @@
                 <w:lang w:val="fr-FR" w:eastAsia="fr-MA"/>
               </w:rPr>
               <w:t xml:space="preserve"> </w:t>
+            </w:r>
+            <w:r>
+              <w:rPr>
+                <w:rFonts w:ascii="Arial" w:eastAsia="Times New Roman" w:hAnsi="Arial" w:cs="Arial"/>
+                <w:b/>
+                <w:bCs/>
+                <w:sz w:val="20"/>
+                <w:szCs w:val="20"/>
+                <w:lang w:eastAsia="fr-MA"/>
+              </w:rPr>
+              <w:t/>
+            </w:r>
+          </w:p>
+          <w:p>
+            <w:pPr>
+              <w:spacing w:after="0" w:line="240" w:lineRule="auto"/>
+              <w:ind w:left="120"/>
+              <w:rPr>
+                <w:rFonts w:ascii="Arial" w:eastAsia="Times New Roman" w:hAnsi="Arial" w:cs="Arial"/>
+                <w:sz w:val="24"/>
+                <w:szCs w:val="24"/>
+                <w:lang w:val="fr-FR" w:eastAsia="fr-MA"/>
+              </w:rPr>
+            </w:pPr>
+            <w:r>
+              <w:rPr>
+                <w:rFonts w:ascii="Arial" w:eastAsia="Times New Roman" w:hAnsi="Arial" w:cs="Arial"/>
+                <w:sz w:val="24"/>
+                <w:szCs w:val="24"/>
+                <w:lang w:val="fr-FR" w:eastAsia="fr-MA"/>
+              </w:rPr>
+              <w:t xml:space="preserve"> </w:t>
+            </w:r>
+            <w:r>
+              <w:rPr>
+                <w:rFonts w:ascii="Arial" w:eastAsia="Times New Roman" w:hAnsi="Arial" w:cs="Arial"/>
+                <w:b/>
+                <w:bCs/>
+                <w:sz w:val="20"/>
+                <w:szCs w:val="20"/>
+                <w:lang w:eastAsia="fr-MA"/>
+              </w:rPr>
+              <w:t/>
             </w:r>
           </w:p>
           <w:p>
@@ -1075,6 +1037,17 @@
                 <w:lang w:val="en-US" w:eastAsia="fr-MA"/>
               </w:rPr>
             </w:pPr>
+            <w:r>
+              <w:rPr>
+                <w:rFonts w:ascii="Aptos" w:eastAsia="Times New Roman" w:hAnsi="Aptos" w:cs="Arial"/>
+                <w:color w:val="000000"/>
+                <w:kern w:val="24"/>
+                <w:sz w:val="24"/>
+                <w:szCs w:val="24"/>
+                <w:lang w:val="en-US" w:eastAsia="fr-MA"/>
+              </w:rPr>
+              <w:t/>
+            </w:r>
           </w:p>
           <w:p>
             <w:pPr>
@@ -1088,6 +1061,17 @@
                 <w:lang w:val="en-US" w:eastAsia="fr-MA"/>
               </w:rPr>
             </w:pPr>
+            <w:r>
+              <w:rPr>
+                <w:rFonts w:ascii="Aptos" w:eastAsia="Times New Roman" w:hAnsi="Aptos" w:cs="Arial"/>
+                <w:color w:val="000000"/>
+                <w:kern w:val="24"/>
+                <w:sz w:val="24"/>
+                <w:szCs w:val="24"/>
+                <w:lang w:val="en-US" w:eastAsia="fr-MA"/>
+              </w:rPr>
+              <w:t/>
+            </w:r>
           </w:p>
           <w:p>
             <w:pPr>
@@ -1101,6 +1085,17 @@
                 <w:lang w:val="en-US" w:eastAsia="fr-MA"/>
               </w:rPr>
             </w:pPr>
+            <w:r>
+              <w:rPr>
+                <w:rFonts w:ascii="Aptos" w:eastAsia="Times New Roman" w:hAnsi="Aptos" w:cs="Arial"/>
+                <w:color w:val="000000"/>
+                <w:kern w:val="24"/>
+                <w:sz w:val="24"/>
+                <w:szCs w:val="24"/>
+                <w:lang w:val="en-US" w:eastAsia="fr-MA"/>
+              </w:rPr>
+              <w:t/>
+            </w:r>
           </w:p>
         </w:tc>
         <w:tc>
@@ -1165,7 +1160,7 @@
                 <w:szCs w:val="24"/>
                 <w:lang w:val="en-US" w:eastAsia="fr-MA"/>
               </w:rPr>
-              <w:t>1000</w:t>
+              <w:t>700</w:t>
             </w:r>
           </w:p>
           <w:p>
@@ -1180,6 +1175,17 @@
                 <w:lang w:val="en-US" w:eastAsia="fr-MA"/>
               </w:rPr>
             </w:pPr>
+            <w:r>
+              <w:rPr>
+                <w:rFonts w:ascii="Aptos" w:eastAsia="Times New Roman" w:hAnsi="Aptos" w:cs="Arial"/>
+                <w:color w:val="000000"/>
+                <w:kern w:val="24"/>
+                <w:sz w:val="24"/>
+                <w:szCs w:val="24"/>
+                <w:lang w:val="en-US" w:eastAsia="fr-MA"/>
+              </w:rPr>
+              <w:t/>
+            </w:r>
           </w:p>
           <w:p>
             <w:pPr>
@@ -1193,6 +1199,17 @@
                 <w:lang w:val="en-US" w:eastAsia="fr-MA"/>
               </w:rPr>
             </w:pPr>
+            <w:r>
+              <w:rPr>
+                <w:rFonts w:ascii="Aptos" w:eastAsia="Times New Roman" w:hAnsi="Aptos" w:cs="Arial"/>
+                <w:color w:val="000000"/>
+                <w:kern w:val="24"/>
+                <w:sz w:val="24"/>
+                <w:szCs w:val="24"/>
+                <w:lang w:val="en-US" w:eastAsia="fr-MA"/>
+              </w:rPr>
+              <w:t/>
+            </w:r>
           </w:p>
           <w:p>
             <w:pPr>
@@ -1206,6 +1223,17 @@
                 <w:lang w:val="en-US" w:eastAsia="fr-MA"/>
               </w:rPr>
             </w:pPr>
+            <w:r>
+              <w:rPr>
+                <w:rFonts w:ascii="Aptos" w:eastAsia="Times New Roman" w:hAnsi="Aptos" w:cs="Arial"/>
+                <w:color w:val="000000"/>
+                <w:kern w:val="24"/>
+                <w:sz w:val="24"/>
+                <w:szCs w:val="24"/>
+                <w:lang w:val="en-US" w:eastAsia="fr-MA"/>
+              </w:rPr>
+              <w:t/>
+            </w:r>
           </w:p>
         </w:tc>
         <w:tc>
@@ -1270,7 +1298,7 @@
                 <w:szCs w:val="24"/>
                 <w:lang w:val="en-US" w:eastAsia="fr-MA"/>
               </w:rPr>
-              <w:t>4000</w:t>
+              <w:t>2800</w:t>
             </w:r>
           </w:p>
           <w:p>
@@ -1285,6 +1313,17 @@
                 <w:lang w:val="en-US" w:eastAsia="fr-MA"/>
               </w:rPr>
             </w:pPr>
+            <w:r>
+              <w:rPr>
+                <w:rFonts w:ascii="Aptos" w:eastAsia="Times New Roman" w:hAnsi="Aptos" w:cs="Arial"/>
+                <w:color w:val="000000"/>
+                <w:kern w:val="24"/>
+                <w:sz w:val="24"/>
+                <w:szCs w:val="24"/>
+                <w:lang w:val="en-US" w:eastAsia="fr-MA"/>
+              </w:rPr>
+              <w:t/>
+            </w:r>
           </w:p>
           <w:p>
             <w:pPr>
@@ -1298,6 +1337,17 @@
                 <w:lang w:val="en-US" w:eastAsia="fr-MA"/>
               </w:rPr>
             </w:pPr>
+            <w:r>
+              <w:rPr>
+                <w:rFonts w:ascii="Aptos" w:eastAsia="Times New Roman" w:hAnsi="Aptos" w:cs="Arial"/>
+                <w:color w:val="000000"/>
+                <w:kern w:val="24"/>
+                <w:sz w:val="24"/>
+                <w:szCs w:val="24"/>
+                <w:lang w:val="en-US" w:eastAsia="fr-MA"/>
+              </w:rPr>
+              <w:t/>
+            </w:r>
           </w:p>
           <w:p>
             <w:pPr>
@@ -1311,6 +1361,17 @@
                 <w:lang w:val="en-US" w:eastAsia="fr-MA"/>
               </w:rPr>
             </w:pPr>
+            <w:r>
+              <w:rPr>
+                <w:rFonts w:ascii="Aptos" w:eastAsia="Times New Roman" w:hAnsi="Aptos" w:cs="Arial"/>
+                <w:color w:val="000000"/>
+                <w:kern w:val="24"/>
+                <w:sz w:val="24"/>
+                <w:szCs w:val="24"/>
+                <w:lang w:val="en-US" w:eastAsia="fr-MA"/>
+              </w:rPr>
+              <w:t/>
+            </w:r>
           </w:p>
         </w:tc>
       </w:tr>
@@ -1332,9 +1393,9 @@
         <w:tblLook w:val="04A0" w:firstRow="1" w:lastRow="0" w:firstColumn="1" w:lastColumn="0" w:noHBand="0" w:noVBand="1"/>
       </w:tblPr>
       <w:tblGrid>
-        <w:gridCol w:w="5382"/>
-        <w:gridCol w:w="3118"/>
-        <w:gridCol w:w="1276"/>
+        <w:gridCol w:w="5027"/>
+        <w:gridCol w:w="2924"/>
+        <w:gridCol w:w="1825"/>
       </w:tblGrid>
       <w:tr>
         <w:tc>
@@ -1379,8 +1440,10 @@
                 <w:kern w:val="24"/>
                 <w:lang w:eastAsia="fr-MA"/>
               </w:rPr>
-              <w:t>14000</w:t>
+              <w:t>12800</w:t>
             </w:r>
+            <w:proofErr w:type="spellStart"/>
+            <w:proofErr w:type="spellEnd"/>
           </w:p>
         </w:tc>
       </w:tr>
@@ -1418,8 +1481,10 @@
               </w:rPr>
             </w:pPr>
             <w:r>
-              <w:t>ARRETE LA PRESENTE FACTURE A LA SOMME DE : #Quatorze mille dirhams#</w:t>
+              <w:t>ARRETE LA PRESENTE FACTURE A LA SOMME DE : #Douze mille huit cents dirhams#</w:t>
             </w:r>
+            <w:proofErr w:type="gramStart"/>
+            <w:proofErr w:type="gramEnd"/>
           </w:p>
           <w:p>
             <w:pPr>
@@ -1447,6 +1512,10 @@
               </w:rPr>
               <w:t>Attijariwafa Bank RIB :  007780000401230040249794</w:t>
             </w:r>
+            <w:proofErr w:type="gramStart"/>
+            <w:proofErr w:type="gramEnd"/>
+            <w:proofErr w:type="spellStart"/>
+            <w:proofErr w:type="spellEnd"/>
           </w:p>
         </w:tc>
       </w:tr>
@@ -1483,13 +1552,13 @@
           <w:noProof/>
         </w:rPr>
         <w:drawing>
-          <wp:anchor distT="0" distB="0" distL="114300" distR="114300" simplePos="0" relativeHeight="251668480" behindDoc="1" locked="0" layoutInCell="1" allowOverlap="1" wp14:anchorId="730BAF44" wp14:editId="62C8E9EB">
+          <wp:anchor distT="0" distB="0" distL="114300" distR="114300" simplePos="0" relativeHeight="251669504" behindDoc="1" locked="0" layoutInCell="1" allowOverlap="1" wp14:anchorId="045ED61C" wp14:editId="432108D9">
             <wp:simplePos x="0" y="0"/>
             <wp:positionH relativeFrom="column">
-              <wp:posOffset>4603221</wp:posOffset>
+              <wp:posOffset>4559654</wp:posOffset>
             </wp:positionH>
             <wp:positionV relativeFrom="paragraph">
-              <wp:posOffset>84021</wp:posOffset>
+              <wp:posOffset>95088</wp:posOffset>
             </wp:positionV>
             <wp:extent cx="1587500" cy="683260"/>
             <wp:effectExtent l="38100" t="76200" r="50800" b="97790"/>
@@ -1544,6 +1613,7 @@
             </wp14:sizeRelV>
           </wp:anchor>
         </w:drawing>
+        <w:t/>
       </w:r>
       <w:r>
         <w:rPr>

</xml_diff>